<commit_message>
fix(plantillas): tanda 1 de la auditoria - las citas 'Fuente: ..., XXXX.' usan {fuente_anio} (53 citas en 12 plantillas) y 10 pies de indice reusan el tag de su cuerpo
Antes el 'XXXX' llegaba literal al informe final en 12 de las 14 plantillas. Tag compartido FUENTE_ANIO_FIELDS (DATE year), mismo criterio que Suelos/Biota. Respaldos previos en templates/reports/_backups_2026-09-23/. La prueba templatePlaceholders.test.ts ahora cubre las 14 plantillas.

Quedan para la tanda 2: 'Fuente: XXXX, 202X.' de 65-09, indice de 67-11 y Figura 1 de 65-07, NOMBRE CLIENTE/EMPRESA, fechas/historial DD-MM-AAAA, instrucciones editoriales y linea OT del encabezado.

Co-Authored-By: Claude Sonnet 5 <noreply@anthropic.com>
</commit_message>
<xml_diff>
--- a/server/templates/reports/FO-PO-PSM-64-08 FORMATO PARA LA ELABORACIÓN DE INFORME TÉCNICO DE AGUA SUBTERRÁNEA-plantilla.docx
+++ b/server/templates/reports/FO-PO-PSM-64-08 FORMATO PARA LA ELABORACIÓN DE INFORME TÉCNICO DE AGUA SUBTERRÁNEA-plantilla.docx
@@ -3924,7 +3924,7 @@
             <w:noProof/>
             <w:lang w:val="es-CO"/>
           </w:rPr>
-          <w:t>Fotografía 1. XXXX</w:t>
+          <w:t>Fotografía 1. {figura1_caption}</w:t>
         </w:r>
         <w:r>
           <w:rPr>
@@ -4000,7 +4000,7 @@
             <w:noProof/>
             <w:lang w:val="es-CO"/>
           </w:rPr>
-          <w:t>Fotografía 2. XXXX</w:t>
+          <w:t>Fotografía 2. {figura2_caption}</w:t>
         </w:r>
         <w:r>
           <w:rPr>
@@ -18472,7 +18472,7 @@
           <w:szCs w:val="20"/>
           <w:lang w:val="es-CO"/>
         </w:rPr>
-        <w:t>XXXX</w:t>
+        <w:t>{fuente_anio}</w:t>
       </w:r>
       <w:r>
         <w:rPr>
@@ -20073,7 +20073,7 @@
           <w:szCs w:val="20"/>
           <w:lang w:val="es-CO"/>
         </w:rPr>
-        <w:t>XXXX</w:t>
+        <w:t>{fuente_anio}</w:t>
       </w:r>
       <w:r>
         <w:rPr>

</xml_diff>

<commit_message>
revert(plantillas): volver plantillas de informes y templateConfigs.ts al estado original aprobado
Hernan indico que las plantillas ya estaban aprobadas. Se restauran exactamente desde la etiqueta antes-de-plantillas-2026-09-23 (identicas a 4b49642): se quitan los cambios de las tandas 1-3, Biota, Suelos, indices y el test templatePlaceholders. Se conserva el arreglo del PDF de muestreo (eaff600, aa9106e) y el tipo TS (4979b92). El historial de cambios queda en git y en las etiquetas/zip de respaldo.

Co-Authored-By: Claude Sonnet 5 <noreply@anthropic.com>
</commit_message>
<xml_diff>
--- a/server/templates/reports/FO-PO-PSM-64-08 FORMATO PARA LA ELABORACIÓN DE INFORME TÉCNICO DE AGUA SUBTERRÁNEA-plantilla.docx
+++ b/server/templates/reports/FO-PO-PSM-64-08 FORMATO PARA LA ELABORACIÓN DE INFORME TÉCNICO DE AGUA SUBTERRÁNEA-plantilla.docx
@@ -3924,7 +3924,7 @@
             <w:noProof/>
             <w:lang w:val="es-CO"/>
           </w:rPr>
-          <w:t>Fotografía 1. {figura1_caption}</w:t>
+          <w:t>Fotografía 1. XXXX</w:t>
         </w:r>
         <w:r>
           <w:rPr>
@@ -4000,7 +4000,7 @@
             <w:noProof/>
             <w:lang w:val="es-CO"/>
           </w:rPr>
-          <w:t>Fotografía 2. {figura2_caption}</w:t>
+          <w:t>Fotografía 2. XXXX</w:t>
         </w:r>
         <w:r>
           <w:rPr>
@@ -9921,7 +9921,7 @@
           <w:sz w:val="22"/>
           <w:szCs w:val="22"/>
         </w:rPr>
-        <w:t xml:space="preserve">Se realizó muestreo integrado espacial, conformando una muestra compuesta a partir de </w:t>
+        <w:t>Se realizó muestreo integrado espacial, conformando una muestra compuesta a partir de [</w:t>
       </w:r>
       <w:r>
         <w:rPr>
@@ -9932,7 +9932,7 @@
           <w:sz w:val="22"/>
           <w:szCs w:val="22"/>
         </w:rPr>
-        <w:t>{muestreo_espacial_n}</w:t>
+        <w:t>n = ___</w:t>
       </w:r>
       <w:r>
         <w:rPr>
@@ -9941,7 +9941,7 @@
           <w:sz w:val="22"/>
           <w:szCs w:val="22"/>
         </w:rPr>
-        <w:t xml:space="preserve"> submuestras recolectadas en </w:t>
+        <w:t>] submuestras recolectadas en [</w:t>
       </w:r>
       <w:r>
         <w:rPr>
@@ -9952,7 +9952,7 @@
           <w:sz w:val="22"/>
           <w:szCs w:val="22"/>
         </w:rPr>
-        <w:t>{muestreo_espacial_vertices}</w:t>
+        <w:t>vértices/puntos</w:t>
       </w:r>
       <w:r>
         <w:rPr>
@@ -9961,7 +9961,7 @@
           <w:sz w:val="22"/>
           <w:szCs w:val="22"/>
         </w:rPr>
-        <w:t xml:space="preserve"> definidos dentro del área/sección evaluada </w:t>
+        <w:t xml:space="preserve">] definidos dentro del área/sección evaluada </w:t>
       </w:r>
       <w:r>
         <w:rPr>
@@ -9972,7 +9972,7 @@
           <w:sz w:val="22"/>
           <w:szCs w:val="22"/>
         </w:rPr>
-        <w:t>{muestreo_espacial_arreglo}</w:t>
+        <w:t>([descripción del arreglo: transecto / polígono / margen-centro-margen u otro: ___]</w:t>
       </w:r>
       <w:r>
         <w:rPr>
@@ -9981,7 +9981,7 @@
           <w:sz w:val="22"/>
           <w:szCs w:val="22"/>
         </w:rPr>
-        <w:t xml:space="preserve">. Las ubicaciones de referencia fueron </w:t>
+        <w:t>). Las ubicaciones de referencia fueron [</w:t>
       </w:r>
       <w:r>
         <w:rPr>
@@ -9992,7 +9992,7 @@
           <w:sz w:val="22"/>
           <w:szCs w:val="22"/>
         </w:rPr>
-        <w:t>{muestreo_espacial_puntos}</w:t>
+        <w:t>listar puntos</w:t>
       </w:r>
       <w:r>
         <w:rPr>
@@ -10001,7 +10001,7 @@
           <w:sz w:val="22"/>
           <w:szCs w:val="22"/>
         </w:rPr>
-        <w:t xml:space="preserve">. Cada submuestra tuvo un volumen de </w:t>
+        <w:t>]. Cada submuestra tuvo un volumen de [</w:t>
       </w:r>
       <w:r>
         <w:rPr>
@@ -10012,7 +10012,7 @@
           <w:sz w:val="22"/>
           <w:szCs w:val="22"/>
         </w:rPr>
-        <w:t xml:space="preserve">{muestreo_espacial_volumen} </w:t>
+        <w:t xml:space="preserve">V = ___ </w:t>
       </w:r>
       <w:proofErr w:type="spellStart"/>
       <w:r>
@@ -10036,7 +10036,7 @@
           <w:sz w:val="22"/>
           <w:szCs w:val="22"/>
         </w:rPr>
-        <w:t xml:space="preserve"> (o volumen equivalente</w:t>
+        <w:t>] (o volumen equivalente</w:t>
       </w:r>
       <w:r>
         <w:rPr>
@@ -10130,7 +10130,7 @@
           <w:sz w:val="22"/>
           <w:szCs w:val="22"/>
         </w:rPr>
-        <w:t xml:space="preserve">Se efectuó muestreo integrado por profundidad, recolectando submuestras en </w:t>
+        <w:t>Se efectuó muestreo integrado por profundidad, recolectando submuestras en [</w:t>
       </w:r>
       <w:r>
         <w:rPr>
@@ -10141,7 +10141,7 @@
           <w:sz w:val="22"/>
           <w:szCs w:val="22"/>
         </w:rPr>
-        <w:t>{muestreo_profundidad_n}</w:t>
+        <w:t>n = ___</w:t>
       </w:r>
       <w:r>
         <w:rPr>
@@ -10150,7 +10150,7 @@
           <w:sz w:val="22"/>
           <w:szCs w:val="22"/>
         </w:rPr>
-        <w:t xml:space="preserve"> niveles/estratos a profundidades de </w:t>
+        <w:t xml:space="preserve">] niveles/estratos a profundidades de </w:t>
       </w:r>
       <w:r>
         <w:rPr>
@@ -10161,7 +10161,7 @@
           <w:sz w:val="22"/>
           <w:szCs w:val="22"/>
         </w:rPr>
-        <w:t>{muestreo_profundidad_valores}</w:t>
+        <w:t>[diligenciar profundidades]</w:t>
       </w:r>
       <w:r>
         <w:rPr>
@@ -10189,7 +10189,7 @@
           <w:sz w:val="22"/>
           <w:szCs w:val="22"/>
         </w:rPr>
-        <w:t xml:space="preserve">. Las submuestras fueron integradas en proporciones </w:t>
+        <w:t>. Las submuestras fueron integradas en proporciones [</w:t>
       </w:r>
       <w:r>
         <w:rPr>
@@ -10199,7 +10199,7 @@
           <w:szCs w:val="22"/>
           <w:highlight w:val="cyan"/>
         </w:rPr>
-        <w:t>{muestreo_profundidad_proporciones}</w:t>
+        <w:t>iguales / ponderadas: ___]</w:t>
       </w:r>
       <w:r>
         <w:rPr>
@@ -10285,7 +10285,7 @@
           <w:sz w:val="22"/>
           <w:szCs w:val="22"/>
         </w:rPr>
-        <w:t>{formatos_empleados}</w:t>
+        <w:t>diligenciar código y nombre de formatos empleados</w:t>
       </w:r>
       <w:r>
         <w:rPr>
@@ -11581,7 +11581,7 @@
                 <w:highlight w:val="cyan"/>
                 <w:lang w:val="es-CO" w:eastAsia="es-CO"/>
               </w:rPr>
-              <w:t>{celda_resultado}</w:t>
+              <w:t>XX</w:t>
             </w:r>
           </w:p>
         </w:tc>
@@ -11613,7 +11613,7 @@
                 <w:highlight w:val="cyan"/>
                 <w:lang w:val="es-CO" w:eastAsia="es-CO"/>
               </w:rPr>
-              <w:t>{celda_resultado}</w:t>
+              <w:t>XX</w:t>
             </w:r>
           </w:p>
         </w:tc>
@@ -11643,7 +11643,7 @@
                 <w:highlight w:val="cyan"/>
                 <w:lang w:val="es-CO" w:eastAsia="es-CO"/>
               </w:rPr>
-              <w:t>{celda_resultado}</w:t>
+              <w:t>XX</w:t>
             </w:r>
           </w:p>
         </w:tc>
@@ -11674,7 +11674,7 @@
                 <w:highlight w:val="cyan"/>
                 <w:lang w:val="es-CO" w:eastAsia="es-CO"/>
               </w:rPr>
-              <w:t>{celda_resultado}</w:t>
+              <w:t>XX</w:t>
             </w:r>
           </w:p>
         </w:tc>
@@ -17523,7 +17523,7 @@
                 <w:sz w:val="20"/>
                 <w:szCs w:val="20"/>
               </w:rPr>
-              <w:t>{celda_resultado}</w:t>
+              <w:t>XX</w:t>
             </w:r>
           </w:p>
         </w:tc>
@@ -18472,7 +18472,7 @@
           <w:szCs w:val="20"/>
           <w:lang w:val="es-CO"/>
         </w:rPr>
-        <w:t>{fuente_anio}</w:t>
+        <w:t>XXXX</w:t>
       </w:r>
       <w:r>
         <w:rPr>
@@ -20073,7 +20073,7 @@
           <w:szCs w:val="20"/>
           <w:lang w:val="es-CO"/>
         </w:rPr>
-        <w:t>{fuente_anio}</w:t>
+        <w:t>XXXX</w:t>
       </w:r>
       <w:r>
         <w:rPr>
@@ -20153,7 +20153,7 @@
           <w:highlight w:val="cyan"/>
           <w:lang w:val="es-CO"/>
         </w:rPr>
-        <w:t>{matriz_aguas_texto}</w:t>
+        <w:t>XX</w:t>
       </w:r>
       <w:r>
         <w:rPr>
@@ -20185,7 +20185,7 @@
           <w:highlight w:val="cyan"/>
           <w:lang w:val="es-CO"/>
         </w:rPr>
-        <w:t>{cloruros_valor}</w:t>
+        <w:t>XX</w:t>
       </w:r>
       <w:r>
         <w:rPr>
@@ -21855,7 +21855,7 @@
           <w:highlight w:val="cyan"/>
           <w:lang w:val="es-CO"/>
         </w:rPr>
-        <w:t>{numero_puntos}</w:t>
+        <w:t>X</w:t>
       </w:r>
       <w:r>
         <w:rPr>
@@ -21866,7 +21866,7 @@
           <w:highlight w:val="cyan"/>
           <w:lang w:val="es-CO"/>
         </w:rPr>
-        <w:t xml:space="preserve"/>
+        <w:t xml:space="preserve"> (</w:t>
       </w:r>
       <w:r>
         <w:rPr>
@@ -21877,7 +21877,7 @@
           <w:highlight w:val="cyan"/>
           <w:lang w:val="es-CO"/>
         </w:rPr>
-        <w:t/>
+        <w:t>X</w:t>
       </w:r>
       <w:r>
         <w:rPr>
@@ -21888,7 +21888,7 @@
           <w:highlight w:val="cyan"/>
           <w:lang w:val="es-CO"/>
         </w:rPr>
-        <w:t xml:space="preserve"> punto</w:t>
+        <w:t>) punto</w:t>
       </w:r>
       <w:r>
         <w:rPr>

</xml_diff>